<commit_message>
meilleir design de la piste de Garde
</commit_message>
<xml_diff>
--- a/pictures/Quartiers-de-Garde-fr/Quartiers-de-Garde-fr.docx
+++ b/pictures/Quartiers-de-Garde-fr/Quartiers-de-Garde-fr.docx
@@ -808,10 +808,26 @@
           <w:noProof/>
         </w:rPr>
         <w:drawing>
-          <wp:inline distT="0" distB="0" distL="0" distR="0" wp14:anchorId="7FB40FC5" wp14:editId="7F7AF489">
-            <wp:extent cx="7962265" cy="5078095"/>
-            <wp:effectExtent l="0" t="0" r="635" b="8255"/>
-            <wp:docPr id="1562606572" name="Image 1"/>
+          <wp:anchor distT="0" distB="0" distL="114300" distR="114300" simplePos="0" relativeHeight="251658240" behindDoc="1" locked="0" layoutInCell="1" allowOverlap="1" wp14:anchorId="3B8AD935" wp14:editId="4EBD4575">
+            <wp:simplePos x="0" y="0"/>
+            <wp:positionH relativeFrom="column">
+              <wp:posOffset>913448</wp:posOffset>
+            </wp:positionH>
+            <wp:positionV relativeFrom="paragraph">
+              <wp:posOffset>678497</wp:posOffset>
+            </wp:positionV>
+            <wp:extent cx="4517390" cy="3444875"/>
+            <wp:effectExtent l="2857" t="0" r="318" b="317"/>
+            <wp:wrapTight wrapText="bothSides">
+              <wp:wrapPolygon edited="0">
+                <wp:start x="14" y="21618"/>
+                <wp:lineTo x="21510" y="21618"/>
+                <wp:lineTo x="21510" y="117"/>
+                <wp:lineTo x="14" y="117"/>
+                <wp:lineTo x="14" y="21618"/>
+              </wp:wrapPolygon>
+            </wp:wrapTight>
+            <wp:docPr id="675501877" name="Image 2"/>
             <wp:cNvGraphicFramePr>
               <a:graphicFrameLocks xmlns:a="http://schemas.openxmlformats.org/drawingml/2006/main" noChangeAspect="1"/>
             </wp:cNvGraphicFramePr>
@@ -819,13 +835,13 @@
               <a:graphicData uri="http://schemas.openxmlformats.org/drawingml/2006/picture">
                 <pic:pic xmlns:pic="http://schemas.openxmlformats.org/drawingml/2006/picture">
                   <pic:nvPicPr>
-                    <pic:cNvPr id="0" name="Picture 2"/>
+                    <pic:cNvPr id="0" name="Picture 3"/>
                     <pic:cNvPicPr>
                       <a:picLocks noChangeAspect="1" noChangeArrowheads="1"/>
                     </pic:cNvPicPr>
                   </pic:nvPicPr>
                   <pic:blipFill>
-                    <a:blip r:embed="rId41">
+                    <a:blip r:embed="rId41" cstate="print">
                       <a:extLst>
                         <a:ext uri="{28A0092B-C50C-407E-A947-70E740481C1C}">
                           <a14:useLocalDpi xmlns:a14="http://schemas.microsoft.com/office/drawing/2010/main" val="0"/>
@@ -838,19 +854,103 @@
                     </a:stretch>
                   </pic:blipFill>
                   <pic:spPr bwMode="auto">
-                    <a:xfrm>
+                    <a:xfrm rot="5400000">
                       <a:off x="0" y="0"/>
-                      <a:ext cx="7962265" cy="5078095"/>
+                      <a:ext cx="4517390" cy="3444875"/>
                     </a:xfrm>
                     <a:prstGeom prst="rect">
                       <a:avLst/>
                     </a:prstGeom>
                     <a:noFill/>
+                    <a:ln>
+                      <a:noFill/>
+                    </a:ln>
                   </pic:spPr>
                 </pic:pic>
               </a:graphicData>
             </a:graphic>
-          </wp:inline>
+            <wp14:sizeRelH relativeFrom="margin">
+              <wp14:pctWidth>0</wp14:pctWidth>
+            </wp14:sizeRelH>
+            <wp14:sizeRelV relativeFrom="margin">
+              <wp14:pctHeight>0</wp14:pctHeight>
+            </wp14:sizeRelV>
+          </wp:anchor>
+        </w:drawing>
+      </w:r>
+      <w:r>
+        <w:rPr>
+          <w:noProof/>
+        </w:rPr>
+        <w:drawing>
+          <wp:anchor distT="0" distB="0" distL="114300" distR="114300" simplePos="0" relativeHeight="251660288" behindDoc="1" locked="0" layoutInCell="1" allowOverlap="1" wp14:anchorId="6695493E" wp14:editId="3C060A13">
+            <wp:simplePos x="0" y="0"/>
+            <wp:positionH relativeFrom="column">
+              <wp:posOffset>5439728</wp:posOffset>
+            </wp:positionH>
+            <wp:positionV relativeFrom="paragraph">
+              <wp:posOffset>686752</wp:posOffset>
+            </wp:positionV>
+            <wp:extent cx="4517390" cy="3444875"/>
+            <wp:effectExtent l="2857" t="0" r="318" b="317"/>
+            <wp:wrapTight wrapText="bothSides">
+              <wp:wrapPolygon edited="0">
+                <wp:start x="14" y="21618"/>
+                <wp:lineTo x="21510" y="21618"/>
+                <wp:lineTo x="21510" y="117"/>
+                <wp:lineTo x="14" y="117"/>
+                <wp:lineTo x="14" y="21618"/>
+              </wp:wrapPolygon>
+            </wp:wrapTight>
+            <wp:docPr id="1760688049" name="Image 2"/>
+            <wp:cNvGraphicFramePr>
+              <a:graphicFrameLocks xmlns:a="http://schemas.openxmlformats.org/drawingml/2006/main" noChangeAspect="1"/>
+            </wp:cNvGraphicFramePr>
+            <a:graphic xmlns:a="http://schemas.openxmlformats.org/drawingml/2006/main">
+              <a:graphicData uri="http://schemas.openxmlformats.org/drawingml/2006/picture">
+                <pic:pic xmlns:pic="http://schemas.openxmlformats.org/drawingml/2006/picture">
+                  <pic:nvPicPr>
+                    <pic:cNvPr id="0" name="Picture 3"/>
+                    <pic:cNvPicPr>
+                      <a:picLocks noChangeAspect="1" noChangeArrowheads="1"/>
+                    </pic:cNvPicPr>
+                  </pic:nvPicPr>
+                  <pic:blipFill>
+                    <a:blip r:embed="rId41" cstate="print">
+                      <a:extLst>
+                        <a:ext uri="{28A0092B-C50C-407E-A947-70E740481C1C}">
+                          <a14:useLocalDpi xmlns:a14="http://schemas.microsoft.com/office/drawing/2010/main" val="0"/>
+                        </a:ext>
+                      </a:extLst>
+                    </a:blip>
+                    <a:srcRect/>
+                    <a:stretch>
+                      <a:fillRect/>
+                    </a:stretch>
+                  </pic:blipFill>
+                  <pic:spPr bwMode="auto">
+                    <a:xfrm rot="5400000">
+                      <a:off x="0" y="0"/>
+                      <a:ext cx="4517390" cy="3444875"/>
+                    </a:xfrm>
+                    <a:prstGeom prst="rect">
+                      <a:avLst/>
+                    </a:prstGeom>
+                    <a:noFill/>
+                    <a:ln>
+                      <a:noFill/>
+                    </a:ln>
+                  </pic:spPr>
+                </pic:pic>
+              </a:graphicData>
+            </a:graphic>
+            <wp14:sizeRelH relativeFrom="margin">
+              <wp14:pctWidth>0</wp14:pctWidth>
+            </wp14:sizeRelH>
+            <wp14:sizeRelV relativeFrom="margin">
+              <wp14:pctHeight>0</wp14:pctHeight>
+            </wp14:sizeRelV>
+          </wp:anchor>
         </w:drawing>
       </w:r>
     </w:p>

</xml_diff>